<commit_message>
Add new resources and citations to the bibliography
- Added a new image file: testaufbau.jpg
- Included online resource for IANA service names and port numbers
- Added oral citations regarding the usability of the SENTRON Powerconfig mobile application and Modbus remote switching support from Siemens AG
</commit_message>
<xml_diff>
--- a/Probleme ECPD.docx
+++ b/Probleme ECPD.docx
@@ -22,15 +22,7 @@
         <w:t>Dokumentation mit verschiedenen Nennstromwerten: stehen zu viele, Stimmen für ECPD nicht</w:t>
       </w:r>
       <w:r>
-        <w:t xml:space="preserve"> (</w:t>
-      </w:r>
-      <w:proofErr w:type="spellStart"/>
-      <w:r>
-        <w:t>max</w:t>
-      </w:r>
-      <w:proofErr w:type="spellEnd"/>
-      <w:r>
-        <w:t xml:space="preserve"> 10 A möglich)</w:t>
+        <w:t xml:space="preserve"> (max 10 A möglich)</w:t>
       </w:r>
     </w:p>
     <w:p>
@@ -42,23 +34,7 @@
         </w:numPr>
       </w:pPr>
       <w:r>
-        <w:t xml:space="preserve">Bei Passworterstellung: fehlendes Sonderzeichen gibt 404 not </w:t>
-      </w:r>
-      <w:proofErr w:type="spellStart"/>
-      <w:r>
-        <w:t>found</w:t>
-      </w:r>
-      <w:proofErr w:type="spellEnd"/>
-      <w:r>
-        <w:t xml:space="preserve"> </w:t>
-      </w:r>
-      <w:proofErr w:type="spellStart"/>
-      <w:r>
-        <w:t>error</w:t>
-      </w:r>
-      <w:proofErr w:type="spellEnd"/>
-      <w:r>
-        <w:t xml:space="preserve"> anstatt was sinnvolles wie Warnung, dass das Sonderzeichen fehlt</w:t>
+        <w:t>Bei Passworterstellung: fehlendes Sonderzeichen gibt 404 not found error anstatt was sinnvolles wie Warnung, dass das Sonderzeichen fehlt</w:t>
       </w:r>
     </w:p>
     <w:p>
@@ -73,13 +49,8 @@
         <w:t>Schaltvorgänge</w:t>
       </w:r>
       <w:r>
-        <w:t xml:space="preserve"> über </w:t>
-      </w:r>
-      <w:proofErr w:type="spellStart"/>
-      <w:r>
-        <w:t>Powerconfig</w:t>
-      </w:r>
-      <w:proofErr w:type="spellEnd"/>
+        <w:t xml:space="preserve"> über Powerconfig</w:t>
+      </w:r>
       <w:r>
         <w:t xml:space="preserve"> gehen immer ins mechanische Schalten, nicht aber ins elektrische Schalten</w:t>
       </w:r>
@@ -93,27 +64,14 @@
         </w:numPr>
       </w:pPr>
       <w:r>
-        <w:t xml:space="preserve">Power Device Engineer macht für Bool-Werte </w:t>
-      </w:r>
-      <w:proofErr w:type="spellStart"/>
-      <w:r>
-        <w:t>standardmäßiig</w:t>
-      </w:r>
-      <w:proofErr w:type="spellEnd"/>
-      <w:r>
-        <w:t xml:space="preserve"> 0x0f-Befehle anstatt 0x10. ECPD scheint diesen Befehl nicht zu unterstützen</w:t>
+        <w:t>Power Device Engineer macht für Bool-Werte standardmäßiig 0x0f-Befehle anstatt 0x10. ECPD scheint diesen Befehl nicht zu unterstützen</w:t>
       </w:r>
     </w:p>
     <w:p/>
     <w:p>
       <w:r>
-        <w:t xml:space="preserve">Schalten über diese Ansicht geht </w:t>
-      </w:r>
-      <w:proofErr w:type="gramStart"/>
-      <w:r>
-        <w:t>einfach nicht</w:t>
-      </w:r>
-      <w:proofErr w:type="gramEnd"/>
+        <w:t>Schalten über diese Ansicht geht einfach nicht</w:t>
+      </w:r>
       <w:r>
         <w:t>, Blinkmodus funktioniert</w:t>
       </w:r>
@@ -123,6 +81,9 @@
     </w:p>
     <w:p>
       <w:r>
+        <w:rPr>
+          <w:noProof/>
+        </w:rPr>
         <w:drawing>
           <wp:inline distT="0" distB="0" distL="0" distR="0" wp14:anchorId="69091F7F" wp14:editId="69469F7E">
             <wp:extent cx="3074793" cy="2234241"/>
@@ -162,83 +123,32 @@
     </w:p>
     <w:p/>
     <w:p>
-      <w:proofErr w:type="spellStart"/>
-      <w:r>
-        <w:t>Black box</w:t>
-      </w:r>
-      <w:proofErr w:type="spellEnd"/>
-      <w:r>
-        <w:t xml:space="preserve"> </w:t>
-      </w:r>
-      <w:proofErr w:type="spellStart"/>
-      <w:r>
-        <w:t>blob</w:t>
-      </w:r>
-      <w:proofErr w:type="spellEnd"/>
-      <w:r>
-        <w:t xml:space="preserve"> in PDE: was macht das genau, wie funktioniert das im Hintergrund? </w:t>
+      <w:r>
+        <w:t xml:space="preserve">Black box blob in PDE: was macht das genau, wie funktioniert das im Hintergrund? </w:t>
       </w:r>
       <w:r>
         <w:sym w:font="Wingdings" w:char="F0E0"/>
       </w:r>
       <w:r>
-        <w:t xml:space="preserve"> beispielsweise bei </w:t>
-      </w:r>
-      <w:proofErr w:type="spellStart"/>
-      <w:r>
-        <w:t>binary</w:t>
-      </w:r>
-      <w:proofErr w:type="spellEnd"/>
-      <w:r>
-        <w:t xml:space="preserve"> werten konnte ich eigentlich nur ausprobieren und hoffen den fix zu finden, es gibt keine </w:t>
-      </w:r>
-      <w:proofErr w:type="spellStart"/>
-      <w:r>
-        <w:t>möglichkeit</w:t>
-      </w:r>
-      <w:proofErr w:type="spellEnd"/>
-      <w:r>
-        <w:t xml:space="preserve"> das irgendwie zu testen</w:t>
+        <w:t xml:space="preserve"> beispielsweise bei binary werten konnte ich eigentlich nur ausprobieren und hoffen den fix zu finden, es gibt keine möglichkeit das irgendwie zu testen</w:t>
       </w:r>
     </w:p>
     <w:p>
       <w:r>
-        <w:t xml:space="preserve">Super </w:t>
-      </w:r>
-      <w:proofErr w:type="spellStart"/>
-      <w:r>
-        <w:t>user</w:t>
-      </w:r>
-      <w:proofErr w:type="spellEnd"/>
-      <w:r>
-        <w:t xml:space="preserve"> muss für remote schalten ohne </w:t>
-      </w:r>
-      <w:proofErr w:type="spellStart"/>
-      <w:r>
-        <w:t>authentifizierung</w:t>
-      </w:r>
-      <w:proofErr w:type="spellEnd"/>
-      <w:r>
-        <w:t xml:space="preserve"> eingerichtet sein in </w:t>
-      </w:r>
-      <w:proofErr w:type="spellStart"/>
-      <w:r>
-        <w:t>Powerconfig</w:t>
-      </w:r>
-      <w:proofErr w:type="spellEnd"/>
-      <w:r>
-        <w:t>/</w:t>
-      </w:r>
-      <w:proofErr w:type="spellStart"/>
-      <w:r>
-        <w:t>website</w:t>
-      </w:r>
-      <w:proofErr w:type="spellEnd"/>
-      <w:r>
-        <w:t xml:space="preserve"> im Fall von Powercenter 2000</w:t>
+        <w:t>Super user muss für remote schalten ohne authentifizierung eingerichtet sein in Powerconfig/website im Fall von Powercenter 2000</w:t>
       </w:r>
     </w:p>
-    <w:p/>
+    <w:p>
+      <w:r>
+        <w:t>PDE: Dateigröße explodiert</w:t>
+      </w:r>
+      <w:r>
+        <w:t xml:space="preserve"> nachdem ich blob zu uint </w:t>
+      </w:r>
+      <w:r>
+        <w:t>von 20 MB zu 150 MB</w:t>
+      </w:r>
+    </w:p>
     <w:sectPr>
       <w:pgSz w:w="11906" w:h="16838"/>
       <w:pgMar w:top="1417" w:right="1417" w:bottom="1134" w:left="1417" w:header="708" w:footer="708" w:gutter="0"/>

</xml_diff>